<commit_message>
Rewrite MT messages in natural Vietnamese with diacritics
Drop the 160-char cap, add char and MT-segment counts per message,
and note the cost trade-off versus unaccented 1-MT messages.

Co-Authored-By: Claude Opus 5.5 <noreply@anthropic.com>
Claude-Session: https://claude.ai/code/session_01FoG3LsmmZXx8yS8vDNmtyj
</commit_message>
<xml_diff>
--- a/sms-campaign/ke-hoach-sms-bao-hiem-xe-may.docx
+++ b/sms-campaign/ke-hoach-sms-bao-hiem-xe-may.docx
@@ -1022,10 +1022,7 @@
         <w:t xml:space="preserve">giảm ~75% chi phí</w:t>
       </w:r>
       <w:r>
-        <w:t xml:space="preserve"> </w:t>
-      </w:r>
-      <w:r>
-        <w:t xml:space="preserve">cùng số người nhận.</w:t>
+        <w:t xml:space="preserve">; nếu giữ có dấu cho tự nhiên (mục 6) thì rút gọn tin và đo xem đơn tăng có bù được cước.</w:t>
       </w:r>
     </w:p>
     <w:p>
@@ -3990,13 +3987,13 @@
           <w:bCs/>
           <w:b/>
         </w:rPr>
-        <w:t xml:space="preserve">Không dấu, ≤160 ký tự</w:t>
+        <w:t xml:space="preserve">Độ dài:</w:t>
       </w:r>
       <w:r>
         <w:t xml:space="preserve"> </w:t>
       </w:r>
       <w:r>
-        <w:t xml:space="preserve">= 1 MT. Mọi tin ở mục 6 đã được đếm (tính link rút gọn 20 ký tự + câu từ chối).</w:t>
+        <w:t xml:space="preserve">có dấu = 67 ký tự/MT, không dấu = 153–160 ký tự/MT. Mục 6 ghi sẵn số ký tự và số MT của từng tin để tính cước.</w:t>
       </w:r>
     </w:p>
     <w:p>
@@ -7131,13 +7128,13 @@
     </w:p>
     <w:bookmarkEnd w:id="34"/>
     <w:bookmarkEnd w:id="35"/>
-    <w:bookmarkStart w:id="41" w:name="X3afba9964abe61a16e7817f91d6af46f17af862"/>
+    <w:bookmarkStart w:id="41" w:name="Xaba2dc0d36eb0d18b0cc7882e1296919072d237"/>
     <w:p>
       <w:pPr>
         <w:pStyle w:val="Heading2"/>
       </w:pPr>
       <w:r>
-        <w:t xml:space="preserve">6. Bộ tin nhắn MT (không dấu, đã đếm ký tự, tất cả = 1 MT)</w:t>
+        <w:t xml:space="preserve">6. Bộ tin nhắn MT (tiếng Việt có dấu, giọng tự nhiên)</w:t>
       </w:r>
     </w:p>
     <w:p>
@@ -7169,22 +7166,58 @@
         <w:rPr>
           <w:rStyle w:val="VerbatimChar"/>
         </w:rPr>
-        <w:t xml:space="preserve">TC gui 9xxx</w:t>
+        <w:t xml:space="preserve">9xxx</w:t>
       </w:r>
       <w:r>
         <w:t xml:space="preserve"> </w:t>
       </w:r>
       <w:r>
-        <w:t xml:space="preserve">= cú pháp từ chối theo đầu số thực tế (⚠️ xác nhận với nhà mạng). Số ký tự đã tính cả hai phần này.</w:t>
+        <w:t xml:space="preserve">= đầu số thật (⚠️ xác nhận cú pháp từ chối với nhà mạng). Ký tự và số MT đã tính cả link và câu từ chối.</w:t>
       </w:r>
     </w:p>
-    <w:bookmarkStart w:id="36" w:name="X84503195d1602f513fbf7b8ebb6228cb2654350"/>
+    <w:p>
+      <w:pPr>
+        <w:pStyle w:val="BodyText"/>
+      </w:pPr>
+      <w:r>
+        <w:rPr>
+          <w:bCs/>
+          <w:b/>
+        </w:rPr>
+        <w:t xml:space="preserve">Cách viết:</w:t>
+      </w:r>
+      <w:r>
+        <w:t xml:space="preserve"> </w:t>
+      </w:r>
+      <w:r>
+        <w:t xml:space="preserve">nói như nhân viên nhắn cho khách quen: câu ngắn, xưng "bạn" và "bên mình", nêu một lý do cụ thể để mua bây giờ, không chất nhiều tính từ, không dùng chữ in hoa hay dấu chấm than liên tục.</w:t>
+      </w:r>
+    </w:p>
+    <w:p>
+      <w:pPr>
+        <w:pStyle w:val="BodyText"/>
+      </w:pPr>
+      <w:r>
+        <w:rPr>
+          <w:bCs/>
+          <w:b/>
+        </w:rPr>
+        <w:t xml:space="preserve">Lưu ý chi phí:</w:t>
+      </w:r>
+      <w:r>
+        <w:t xml:space="preserve"> </w:t>
+      </w:r>
+      <w:r>
+        <w:t xml:space="preserve">tin có dấu được tính 67 ký tự/MT (khi ghép tin), nên mỗi tin dưới đây tốn 3–5 MT thay vì 1. Nên A/B test bản có dấu với bản không dấu ngắn để xem phần tăng đơn có bù được phần tăng cước không.</w:t>
+      </w:r>
+    </w:p>
+    <w:bookmarkStart w:id="36" w:name="X85317c6cff284caf8231c5daa3ff01c0eafab61"/>
     <w:p>
       <w:pPr>
         <w:pStyle w:val="Heading3"/>
       </w:pPr>
       <w:r>
-        <w:t xml:space="preserve">6.1 Retarget người đã click (S1)</w:t>
+        <w:t xml:space="preserve">6.1 Nhắc lại người đã bấm link hôm qua (S1)</w:t>
       </w:r>
     </w:p>
     <w:tbl>
@@ -7204,9 +7237,10 @@
         <w:tblLayout w:type="fixed"/>
       </w:tblPr>
       <w:tblGrid>
-        <w:gridCol w:w="1379"/>
-        <w:gridCol w:w="12037"/>
-        <w:gridCol w:w="1379"/>
+        <w:gridCol w:w="1261"/>
+        <w:gridCol w:w="11010"/>
+        <w:gridCol w:w="1261"/>
+        <w:gridCol w:w="1261"/>
       </w:tblGrid>
       <w:tr>
         <w:trPr>
@@ -7214,7 +7248,7 @@
         </w:trPr>
         <w:tc>
           <w:tcPr>
-            <w:tcW w:w="1379" w:type="dxa"/>
+            <w:tcW w:w="1261" w:type="dxa"/>
             <w:shd w:val="clear" w:color="auto" w:fill="1F3864"/>
           </w:tcPr>
           <w:p>
@@ -7235,7 +7269,7 @@
         </w:tc>
         <w:tc>
           <w:tcPr>
-            <w:tcW w:w="12037" w:type="dxa"/>
+            <w:tcW w:w="11010" w:type="dxa"/>
             <w:shd w:val="clear" w:color="auto" w:fill="1F3864"/>
           </w:tcPr>
           <w:p>
@@ -7256,7 +7290,7 @@
         </w:tc>
         <w:tc>
           <w:tcPr>
-            <w:tcW w:w="1379" w:type="dxa"/>
+            <w:tcW w:w="1261" w:type="dxa"/>
             <w:shd w:val="clear" w:color="auto" w:fill="1F3864"/>
           </w:tcPr>
           <w:p>
@@ -7272,6 +7306,27 @@
                 <w:sz w:val="19"/>
               </w:rPr>
               <w:t xml:space="preserve">Ký tự</w:t>
+            </w:r>
+          </w:p>
+        </w:tc>
+        <w:tc>
+          <w:tcPr>
+            <w:tcW w:w="1261" w:type="dxa"/>
+            <w:shd w:val="clear" w:color="auto" w:fill="1F3864"/>
+          </w:tcPr>
+          <w:p>
+            <w:pPr>
+              <w:pStyle w:val="Compact"/>
+              <w:spacing w:after="40"/>
+              <w:jc w:val="left"/>
+            </w:pPr>
+            <w:r>
+              <w:rPr>
+                <w:b/>
+                <w:color w:val="FFFFFF"/>
+                <w:sz w:val="19"/>
+              </w:rPr>
+              <w:t xml:space="preserve">Số MT</w:t>
             </w:r>
           </w:p>
         </w:tc>
@@ -7279,7 +7334,7 @@
       <w:tr>
         <w:tc>
           <w:tcPr>
-            <w:tcW w:w="1379" w:type="dxa"/>
+            <w:tcW w:w="1261" w:type="dxa"/>
           </w:tcPr>
           <w:p>
             <w:pPr>
@@ -7299,38 +7354,55 @@
         </w:tc>
         <w:tc>
           <w:tcPr>
-            <w:tcW w:w="12037" w:type="dxa"/>
-          </w:tcPr>
-          <w:p>
-            <w:pPr>
-              <w:pStyle w:val="Compact"/>
-              <w:spacing w:after="40"/>
-              <w:jc w:val="left"/>
-            </w:pPr>
-            <w:r>
-              <w:rPr>
-                <w:rStyle w:val="VerbatimChar"/>
-                <w:sz w:val="19"/>
-              </w:rPr>
-              <w:t xml:space="preserve">(QC) Ban da xem BH xe may nhung chua mua xong. Chi 66.000d/nam, tru vao TK dien thoai, 2 phut co chung nhan. Tang 3GB data: [LINK] TC gui 9xxx</w:t>
-            </w:r>
-          </w:p>
-        </w:tc>
-        <w:tc>
-          <w:tcPr>
-            <w:tcW w:w="1379" w:type="dxa"/>
-          </w:tcPr>
-          <w:p>
-            <w:pPr>
-              <w:pStyle w:val="Compact"/>
-              <w:spacing w:after="40"/>
-              <w:jc w:val="left"/>
-            </w:pPr>
-            <w:r>
-              <w:rPr>
-                <w:sz w:val="19"/>
-              </w:rPr>
-              <w:t xml:space="preserve">155</w:t>
+            <w:tcW w:w="11010" w:type="dxa"/>
+          </w:tcPr>
+          <w:p>
+            <w:pPr>
+              <w:pStyle w:val="Compact"/>
+              <w:spacing w:after="40"/>
+              <w:jc w:val="left"/>
+            </w:pPr>
+            <w:r>
+              <w:rPr>
+                <w:sz w:val="19"/>
+              </w:rPr>
+              <w:t xml:space="preserve">(QC) Hôm qua bạn có bấm xem bảo hiểm xe máy nhưng chưa mua xong. Nếu lúc đó bị vướng thì giờ đơn giản hơn rồi: chỉ cần nhập biển số, tiền trừ thẳng vào tài khoản điện thoại, 66.000đ dùng cả năm. Mua xong được tặng thêm 3GB data. Link đây: [LINK]. Không muốn nhận tin nữa, soạn TC gửi 9xxx.</w:t>
+            </w:r>
+          </w:p>
+        </w:tc>
+        <w:tc>
+          <w:tcPr>
+            <w:tcW w:w="1261" w:type="dxa"/>
+          </w:tcPr>
+          <w:p>
+            <w:pPr>
+              <w:pStyle w:val="Compact"/>
+              <w:spacing w:after="40"/>
+              <w:jc w:val="left"/>
+            </w:pPr>
+            <w:r>
+              <w:rPr>
+                <w:sz w:val="19"/>
+              </w:rPr>
+              <w:t xml:space="preserve">302</w:t>
+            </w:r>
+          </w:p>
+        </w:tc>
+        <w:tc>
+          <w:tcPr>
+            <w:tcW w:w="1261" w:type="dxa"/>
+          </w:tcPr>
+          <w:p>
+            <w:pPr>
+              <w:pStyle w:val="Compact"/>
+              <w:spacing w:after="40"/>
+              <w:jc w:val="left"/>
+            </w:pPr>
+            <w:r>
+              <w:rPr>
+                <w:sz w:val="19"/>
+              </w:rPr>
+              <w:t xml:space="preserve">5</w:t>
             </w:r>
           </w:p>
         </w:tc>
@@ -7338,7 +7410,7 @@
       <w:tr>
         <w:tc>
           <w:tcPr>
-            <w:tcW w:w="1379" w:type="dxa"/>
+            <w:tcW w:w="1261" w:type="dxa"/>
           </w:tcPr>
           <w:p>
             <w:pPr>
@@ -7358,38 +7430,55 @@
         </w:tc>
         <w:tc>
           <w:tcPr>
-            <w:tcW w:w="12037" w:type="dxa"/>
-          </w:tcPr>
-          <w:p>
-            <w:pPr>
-              <w:pStyle w:val="Compact"/>
-              <w:spacing w:after="40"/>
-              <w:jc w:val="left"/>
-            </w:pPr>
-            <w:r>
-              <w:rPr>
-                <w:rStyle w:val="VerbatimChar"/>
-                <w:sz w:val="19"/>
-              </w:rPr>
-              <w:t xml:space="preserve">(QC) Con 48h nhan qua: mua BH TNDS xe may 66.000d tang 3GB data. Khong can nhap so khung, so may - chi can bien so: [LINK] TC gui 9xxx</w:t>
-            </w:r>
-          </w:p>
-        </w:tc>
-        <w:tc>
-          <w:tcPr>
-            <w:tcW w:w="1379" w:type="dxa"/>
-          </w:tcPr>
-          <w:p>
-            <w:pPr>
-              <w:pStyle w:val="Compact"/>
-              <w:spacing w:after="40"/>
-              <w:jc w:val="left"/>
-            </w:pPr>
-            <w:r>
-              <w:rPr>
-                <w:sz w:val="19"/>
-              </w:rPr>
-              <w:t xml:space="preserve">147</w:t>
+            <w:tcW w:w="11010" w:type="dxa"/>
+          </w:tcPr>
+          <w:p>
+            <w:pPr>
+              <w:pStyle w:val="Compact"/>
+              <w:spacing w:after="40"/>
+              <w:jc w:val="left"/>
+            </w:pPr>
+            <w:r>
+              <w:rPr>
+                <w:sz w:val="19"/>
+              </w:rPr>
+              <w:t xml:space="preserve">(QC) Nhắc bạn một chút: quà 3GB data khi mua bảo hiểm xe máy chỉ còn đến hết thứ Hai. Mua mất khoảng 2 phút, không cần số khung số máy, có biển số là được: [LINK]. Không muốn nhận tin nữa, soạn TC gửi 9xxx.</w:t>
+            </w:r>
+          </w:p>
+        </w:tc>
+        <w:tc>
+          <w:tcPr>
+            <w:tcW w:w="1261" w:type="dxa"/>
+          </w:tcPr>
+          <w:p>
+            <w:pPr>
+              <w:pStyle w:val="Compact"/>
+              <w:spacing w:after="40"/>
+              <w:jc w:val="left"/>
+            </w:pPr>
+            <w:r>
+              <w:rPr>
+                <w:sz w:val="19"/>
+              </w:rPr>
+              <w:t xml:space="preserve">219</w:t>
+            </w:r>
+          </w:p>
+        </w:tc>
+        <w:tc>
+          <w:tcPr>
+            <w:tcW w:w="1261" w:type="dxa"/>
+          </w:tcPr>
+          <w:p>
+            <w:pPr>
+              <w:pStyle w:val="Compact"/>
+              <w:spacing w:after="40"/>
+              <w:jc w:val="left"/>
+            </w:pPr>
+            <w:r>
+              <w:rPr>
+                <w:sz w:val="19"/>
+              </w:rPr>
+              <w:t xml:space="preserve">4</w:t>
             </w:r>
           </w:p>
         </w:tc>
@@ -7397,7 +7486,7 @@
       <w:tr>
         <w:tc>
           <w:tcPr>
-            <w:tcW w:w="1379" w:type="dxa"/>
+            <w:tcW w:w="1261" w:type="dxa"/>
           </w:tcPr>
           <w:p>
             <w:pPr>
@@ -7417,38 +7506,55 @@
         </w:tc>
         <w:tc>
           <w:tcPr>
-            <w:tcW w:w="12037" w:type="dxa"/>
-          </w:tcPr>
-          <w:p>
-            <w:pPr>
-              <w:pStyle w:val="Compact"/>
-              <w:spacing w:after="40"/>
-              <w:jc w:val="left"/>
-            </w:pPr>
-            <w:r>
-              <w:rPr>
-                <w:rStyle w:val="VerbatimChar"/>
-                <w:sz w:val="19"/>
-              </w:rPr>
-              <w:t xml:space="preserve">(QC) Lan nhac cuoi: qua 3GB data cho BH xe may 66.000d het han 23h59 hom nay. Mua 2 phut: [LINK] TC gui 9xxx</w:t>
-            </w:r>
-          </w:p>
-        </w:tc>
-        <w:tc>
-          <w:tcPr>
-            <w:tcW w:w="1379" w:type="dxa"/>
-          </w:tcPr>
-          <w:p>
-            <w:pPr>
-              <w:pStyle w:val="Compact"/>
-              <w:spacing w:after="40"/>
-              <w:jc w:val="left"/>
-            </w:pPr>
-            <w:r>
-              <w:rPr>
-                <w:sz w:val="19"/>
-              </w:rPr>
-              <w:t xml:space="preserve">121</w:t>
+            <w:tcW w:w="11010" w:type="dxa"/>
+          </w:tcPr>
+          <w:p>
+            <w:pPr>
+              <w:pStyle w:val="Compact"/>
+              <w:spacing w:after="40"/>
+              <w:jc w:val="left"/>
+            </w:pPr>
+            <w:r>
+              <w:rPr>
+                <w:sz w:val="19"/>
+              </w:rPr>
+              <w:t xml:space="preserve">(QC) Đây là tin cuối bên mình nhắc về chuyện này: 23h59 tối nay hết quà 3GB data khi mua bảo hiểm xe máy 66.000đ. Bạn cần thì bấm vào đây nhé: [LINK]. Không muốn nhận tin nữa, soạn TC gửi 9xxx.</w:t>
+            </w:r>
+          </w:p>
+        </w:tc>
+        <w:tc>
+          <w:tcPr>
+            <w:tcW w:w="1261" w:type="dxa"/>
+          </w:tcPr>
+          <w:p>
+            <w:pPr>
+              <w:pStyle w:val="Compact"/>
+              <w:spacing w:after="40"/>
+              <w:jc w:val="left"/>
+            </w:pPr>
+            <w:r>
+              <w:rPr>
+                <w:sz w:val="19"/>
+              </w:rPr>
+              <w:t xml:space="preserve">206</w:t>
+            </w:r>
+          </w:p>
+        </w:tc>
+        <w:tc>
+          <w:tcPr>
+            <w:tcW w:w="1261" w:type="dxa"/>
+          </w:tcPr>
+          <w:p>
+            <w:pPr>
+              <w:pStyle w:val="Compact"/>
+              <w:spacing w:after="40"/>
+              <w:jc w:val="left"/>
+            </w:pPr>
+            <w:r>
+              <w:rPr>
+                <w:sz w:val="19"/>
+              </w:rPr>
+              <w:t xml:space="preserve">4</w:t>
             </w:r>
           </w:p>
         </w:tc>
@@ -7456,7 +7562,7 @@
       <w:tr>
         <w:tc>
           <w:tcPr>
-            <w:tcW w:w="1379" w:type="dxa"/>
+            <w:tcW w:w="1261" w:type="dxa"/>
           </w:tcPr>
           <w:p>
             <w:pPr>
@@ -7476,51 +7582,68 @@
         </w:tc>
         <w:tc>
           <w:tcPr>
-            <w:tcW w:w="12037" w:type="dxa"/>
-          </w:tcPr>
-          <w:p>
-            <w:pPr>
-              <w:pStyle w:val="Compact"/>
-              <w:spacing w:after="40"/>
-              <w:jc w:val="left"/>
-            </w:pPr>
-            <w:r>
-              <w:rPr>
-                <w:rStyle w:val="VerbatimChar"/>
-                <w:sz w:val="19"/>
-              </w:rPr>
-              <w:t xml:space="preserve">(QC) Mua BH xe may 66.000d khong can vao web: soan BH [bien so] gui 9xxx, tien tru vao TK. Tang 3GB data. TC gui 9xxx</w:t>
-            </w:r>
-          </w:p>
-        </w:tc>
-        <w:tc>
-          <w:tcPr>
-            <w:tcW w:w="1379" w:type="dxa"/>
-          </w:tcPr>
-          <w:p>
-            <w:pPr>
-              <w:pStyle w:val="Compact"/>
-              <w:spacing w:after="40"/>
-              <w:jc w:val="left"/>
-            </w:pPr>
-            <w:r>
-              <w:rPr>
-                <w:sz w:val="19"/>
-              </w:rPr>
-              <w:t xml:space="preserve">117</w:t>
+            <w:tcW w:w="11010" w:type="dxa"/>
+          </w:tcPr>
+          <w:p>
+            <w:pPr>
+              <w:pStyle w:val="Compact"/>
+              <w:spacing w:after="40"/>
+              <w:jc w:val="left"/>
+            </w:pPr>
+            <w:r>
+              <w:rPr>
+                <w:sz w:val="19"/>
+              </w:rPr>
+              <w:t xml:space="preserve">(QC) Không tiện vào web thì bạn mua bảo hiểm xe máy bằng tin nhắn cũng được. Soạn BH dấu cách biển số gửi 9xxx, ví dụ BH 29X112345. Phí 66.000đ trừ vào tài khoản, giấy chứng nhận gửi về máy, kèm 3GB data. Không muốn nhận tin nữa, soạn TC gửi 9xxx.</w:t>
+            </w:r>
+          </w:p>
+        </w:tc>
+        <w:tc>
+          <w:tcPr>
+            <w:tcW w:w="1261" w:type="dxa"/>
+          </w:tcPr>
+          <w:p>
+            <w:pPr>
+              <w:pStyle w:val="Compact"/>
+              <w:spacing w:after="40"/>
+              <w:jc w:val="left"/>
+            </w:pPr>
+            <w:r>
+              <w:rPr>
+                <w:sz w:val="19"/>
+              </w:rPr>
+              <w:t xml:space="preserve">247</w:t>
+            </w:r>
+          </w:p>
+        </w:tc>
+        <w:tc>
+          <w:tcPr>
+            <w:tcW w:w="1261" w:type="dxa"/>
+          </w:tcPr>
+          <w:p>
+            <w:pPr>
+              <w:pStyle w:val="Compact"/>
+              <w:spacing w:after="40"/>
+              <w:jc w:val="left"/>
+            </w:pPr>
+            <w:r>
+              <w:rPr>
+                <w:sz w:val="19"/>
+              </w:rPr>
+              <w:t xml:space="preserve">4</w:t>
             </w:r>
           </w:p>
         </w:tc>
       </w:tr>
     </w:tbl>
     <w:bookmarkEnd w:id="36"/>
-    <w:bookmarkStart w:id="37" w:name="X25a4a09e56189fba3867fec41365c323d9a58c4"/>
+    <w:bookmarkStart w:id="37" w:name="X29fbb864702c3e107ed057499b751a94773b77e"/>
     <w:p>
       <w:pPr>
         <w:pStyle w:val="Heading3"/>
       </w:pPr>
       <w:r>
-        <w:t xml:space="preserve">6.2 Tệp mới — chương trình nền KM1 / KM2</w:t>
+        <w:t xml:space="preserve">6.2 Khách mới — chương trình nền KM1 / KM2</w:t>
       </w:r>
     </w:p>
     <w:tbl>
@@ -7540,10 +7663,11 @@
         <w:tblLayout w:type="fixed"/>
       </w:tblPr>
       <w:tblGrid>
-        <w:gridCol w:w="1247"/>
-        <w:gridCol w:w="1411"/>
-        <w:gridCol w:w="10889"/>
-        <w:gridCol w:w="1247"/>
+        <w:gridCol w:w="1162"/>
+        <w:gridCol w:w="1162"/>
+        <w:gridCol w:w="10145"/>
+        <w:gridCol w:w="1162"/>
+        <w:gridCol w:w="1162"/>
       </w:tblGrid>
       <w:tr>
         <w:trPr>
@@ -7551,7 +7675,7 @@
         </w:trPr>
         <w:tc>
           <w:tcPr>
-            <w:tcW w:w="1247" w:type="dxa"/>
+            <w:tcW w:w="1162" w:type="dxa"/>
             <w:shd w:val="clear" w:color="auto" w:fill="1F3864"/>
           </w:tcPr>
           <w:p>
@@ -7572,7 +7696,7 @@
         </w:tc>
         <w:tc>
           <w:tcPr>
-            <w:tcW w:w="1411" w:type="dxa"/>
+            <w:tcW w:w="1162" w:type="dxa"/>
             <w:shd w:val="clear" w:color="auto" w:fill="1F3864"/>
           </w:tcPr>
           <w:p>
@@ -7593,7 +7717,7 @@
         </w:tc>
         <w:tc>
           <w:tcPr>
-            <w:tcW w:w="10889" w:type="dxa"/>
+            <w:tcW w:w="10145" w:type="dxa"/>
             <w:shd w:val="clear" w:color="auto" w:fill="1F3864"/>
           </w:tcPr>
           <w:p>
@@ -7614,7 +7738,7 @@
         </w:tc>
         <w:tc>
           <w:tcPr>
-            <w:tcW w:w="1247" w:type="dxa"/>
+            <w:tcW w:w="1162" w:type="dxa"/>
             <w:shd w:val="clear" w:color="auto" w:fill="1F3864"/>
           </w:tcPr>
           <w:p>
@@ -7630,6 +7754,27 @@
                 <w:sz w:val="19"/>
               </w:rPr>
               <w:t xml:space="preserve">Ký tự</w:t>
+            </w:r>
+          </w:p>
+        </w:tc>
+        <w:tc>
+          <w:tcPr>
+            <w:tcW w:w="1162" w:type="dxa"/>
+            <w:shd w:val="clear" w:color="auto" w:fill="1F3864"/>
+          </w:tcPr>
+          <w:p>
+            <w:pPr>
+              <w:pStyle w:val="Compact"/>
+              <w:spacing w:after="40"/>
+              <w:jc w:val="left"/>
+            </w:pPr>
+            <w:r>
+              <w:rPr>
+                <w:b/>
+                <w:color w:val="FFFFFF"/>
+                <w:sz w:val="19"/>
+              </w:rPr>
+              <w:t xml:space="preserve">Số MT</w:t>
             </w:r>
           </w:p>
         </w:tc>
@@ -7637,7 +7782,7 @@
       <w:tr>
         <w:tc>
           <w:tcPr>
-            <w:tcW w:w="1247" w:type="dxa"/>
+            <w:tcW w:w="1162" w:type="dxa"/>
           </w:tcPr>
           <w:p>
             <w:pPr>
@@ -7657,56 +7802,73 @@
         </w:tc>
         <w:tc>
           <w:tcPr>
-            <w:tcW w:w="1411" w:type="dxa"/>
-          </w:tcPr>
-          <w:p>
-            <w:pPr>
-              <w:pStyle w:val="Compact"/>
-              <w:spacing w:after="40"/>
-              <w:jc w:val="left"/>
-            </w:pPr>
-            <w:r>
-              <w:rPr>
-                <w:sz w:val="19"/>
-              </w:rPr>
-              <w:t xml:space="preserve">S7 rộng</w:t>
-            </w:r>
-          </w:p>
-        </w:tc>
-        <w:tc>
-          <w:tcPr>
-            <w:tcW w:w="10889" w:type="dxa"/>
-          </w:tcPr>
-          <w:p>
-            <w:pPr>
-              <w:pStyle w:val="Compact"/>
-              <w:spacing w:after="40"/>
-              <w:jc w:val="left"/>
-            </w:pPr>
-            <w:r>
-              <w:rPr>
-                <w:rStyle w:val="VerbatimChar"/>
-                <w:sz w:val="19"/>
-              </w:rPr>
-              <w:t xml:space="preserve">(QC) Bao hiem xe may 66.000d/nam, tru TK dien thoai, tang 3GB data. Chung nhan dien tu sau 1 phut, khoi lo bi phat 300.000d: [LINK] TC gui 9xxx</w:t>
-            </w:r>
-          </w:p>
-        </w:tc>
-        <w:tc>
-          <w:tcPr>
-            <w:tcW w:w="1247" w:type="dxa"/>
-          </w:tcPr>
-          <w:p>
-            <w:pPr>
-              <w:pStyle w:val="Compact"/>
-              <w:spacing w:after="40"/>
-              <w:jc w:val="left"/>
-            </w:pPr>
-            <w:r>
-              <w:rPr>
-                <w:sz w:val="19"/>
-              </w:rPr>
-              <w:t xml:space="preserve">156</w:t>
+            <w:tcW w:w="1162" w:type="dxa"/>
+          </w:tcPr>
+          <w:p>
+            <w:pPr>
+              <w:pStyle w:val="Compact"/>
+              <w:spacing w:after="40"/>
+              <w:jc w:val="left"/>
+            </w:pPr>
+            <w:r>
+              <w:rPr>
+                <w:sz w:val="19"/>
+              </w:rPr>
+              <w:t xml:space="preserve">S7</w:t>
+            </w:r>
+          </w:p>
+        </w:tc>
+        <w:tc>
+          <w:tcPr>
+            <w:tcW w:w="10145" w:type="dxa"/>
+          </w:tcPr>
+          <w:p>
+            <w:pPr>
+              <w:pStyle w:val="Compact"/>
+              <w:spacing w:after="40"/>
+              <w:jc w:val="left"/>
+            </w:pPr>
+            <w:r>
+              <w:rPr>
+                <w:sz w:val="19"/>
+              </w:rPr>
+              <w:t xml:space="preserve">(QC) Đi xe máy mà không có bảo hiểm bắt buộc thì bị phạt 200.000–300.000đ, trong khi mua cả năm chỉ 66.000đ. Bạn mua ngay trên điện thoại, tầm 2 phút, tiền trừ vào tài khoản, giấy chứng nhận lưu luôn trong máy. Tháng này mua được tặng 3GB data: [LINK]. Không muốn nhận tin nữa, soạn TC gửi 9xxx.</w:t>
+            </w:r>
+          </w:p>
+        </w:tc>
+        <w:tc>
+          <w:tcPr>
+            <w:tcW w:w="1162" w:type="dxa"/>
+          </w:tcPr>
+          <w:p>
+            <w:pPr>
+              <w:pStyle w:val="Compact"/>
+              <w:spacing w:after="40"/>
+              <w:jc w:val="left"/>
+            </w:pPr>
+            <w:r>
+              <w:rPr>
+                <w:sz w:val="19"/>
+              </w:rPr>
+              <w:t xml:space="preserve">308</w:t>
+            </w:r>
+          </w:p>
+        </w:tc>
+        <w:tc>
+          <w:tcPr>
+            <w:tcW w:w="1162" w:type="dxa"/>
+          </w:tcPr>
+          <w:p>
+            <w:pPr>
+              <w:pStyle w:val="Compact"/>
+              <w:spacing w:after="40"/>
+              <w:jc w:val="left"/>
+            </w:pPr>
+            <w:r>
+              <w:rPr>
+                <w:sz w:val="19"/>
+              </w:rPr>
+              <w:t xml:space="preserve">5</w:t>
             </w:r>
           </w:p>
         </w:tc>
@@ -7714,7 +7876,7 @@
       <w:tr>
         <w:tc>
           <w:tcPr>
-            <w:tcW w:w="1247" w:type="dxa"/>
+            <w:tcW w:w="1162" w:type="dxa"/>
           </w:tcPr>
           <w:p>
             <w:pPr>
@@ -7734,7 +7896,7 @@
         </w:tc>
         <w:tc>
           <w:tcPr>
-            <w:tcW w:w="1411" w:type="dxa"/>
+            <w:tcW w:w="1162" w:type="dxa"/>
           </w:tcPr>
           <w:p>
             <w:pPr>
@@ -7752,38 +7914,55 @@
         </w:tc>
         <w:tc>
           <w:tcPr>
-            <w:tcW w:w="10889" w:type="dxa"/>
-          </w:tcPr>
-          <w:p>
-            <w:pPr>
-              <w:pStyle w:val="Compact"/>
-              <w:spacing w:after="40"/>
-              <w:jc w:val="left"/>
-            </w:pPr>
-            <w:r>
-              <w:rPr>
-                <w:rStyle w:val="VerbatimChar"/>
-                <w:sz w:val="19"/>
-              </w:rPr>
-              <w:t xml:space="preserve">(QC) Anh/chi chay xe moi ngay? Chi 66.000d co BH TNDS xe may ca nam + tang 3GB data. Mua tren dien thoai 2 phut: [LINK] TC gui 9xxx</w:t>
-            </w:r>
-          </w:p>
-        </w:tc>
-        <w:tc>
-          <w:tcPr>
-            <w:tcW w:w="1247" w:type="dxa"/>
-          </w:tcPr>
-          <w:p>
-            <w:pPr>
-              <w:pStyle w:val="Compact"/>
-              <w:spacing w:after="40"/>
-              <w:jc w:val="left"/>
-            </w:pPr>
-            <w:r>
-              <w:rPr>
-                <w:sz w:val="19"/>
-              </w:rPr>
-              <w:t xml:space="preserve">144</w:t>
+            <w:tcW w:w="10145" w:type="dxa"/>
+          </w:tcPr>
+          <w:p>
+            <w:pPr>
+              <w:pStyle w:val="Compact"/>
+              <w:spacing w:after="40"/>
+              <w:jc w:val="left"/>
+            </w:pPr>
+            <w:r>
+              <w:rPr>
+                <w:sz w:val="19"/>
+              </w:rPr>
+              <w:t xml:space="preserve">(QC) Ngày nào cũng chạy xe đi học, đi làm thì nhớ mang theo bảo hiểm xe máy nhé. 66.000đ dùng cả năm, mua trên điện thoại, tiền trừ vào tài khoản. Mua trong tuần này được tặng thêm 3GB data: [LINK]. Không muốn nhận tin nữa, soạn TC gửi 9xxx.</w:t>
+            </w:r>
+          </w:p>
+        </w:tc>
+        <w:tc>
+          <w:tcPr>
+            <w:tcW w:w="1162" w:type="dxa"/>
+          </w:tcPr>
+          <w:p>
+            <w:pPr>
+              <w:pStyle w:val="Compact"/>
+              <w:spacing w:after="40"/>
+              <w:jc w:val="left"/>
+            </w:pPr>
+            <w:r>
+              <w:rPr>
+                <w:sz w:val="19"/>
+              </w:rPr>
+              <w:t xml:space="preserve">254</w:t>
+            </w:r>
+          </w:p>
+        </w:tc>
+        <w:tc>
+          <w:tcPr>
+            <w:tcW w:w="1162" w:type="dxa"/>
+          </w:tcPr>
+          <w:p>
+            <w:pPr>
+              <w:pStyle w:val="Compact"/>
+              <w:spacing w:after="40"/>
+              <w:jc w:val="left"/>
+            </w:pPr>
+            <w:r>
+              <w:rPr>
+                <w:sz w:val="19"/>
+              </w:rPr>
+              <w:t xml:space="preserve">4</w:t>
             </w:r>
           </w:p>
         </w:tc>
@@ -7791,7 +7970,7 @@
       <w:tr>
         <w:tc>
           <w:tcPr>
-            <w:tcW w:w="1247" w:type="dxa"/>
+            <w:tcW w:w="1162" w:type="dxa"/>
           </w:tcPr>
           <w:p>
             <w:pPr>
@@ -7811,7 +7990,7 @@
         </w:tc>
         <w:tc>
           <w:tcPr>
-            <w:tcW w:w="1411" w:type="dxa"/>
+            <w:tcW w:w="1162" w:type="dxa"/>
           </w:tcPr>
           <w:p>
             <w:pPr>
@@ -7829,38 +8008,55 @@
         </w:tc>
         <w:tc>
           <w:tcPr>
-            <w:tcW w:w="10889" w:type="dxa"/>
-          </w:tcPr>
-          <w:p>
-            <w:pPr>
-              <w:pStyle w:val="Compact"/>
-              <w:spacing w:after="40"/>
-              <w:jc w:val="left"/>
-            </w:pPr>
-            <w:r>
-              <w:rPr>
-                <w:rStyle w:val="VerbatimChar"/>
-                <w:sz w:val="19"/>
-              </w:rPr>
-              <w:t xml:space="preserve">(QC) Mua BH xe may 3 nam chi 198.000d, khoi lo gia han, tang the cao 50.000d. Tru vao TK dien thoai: [LINK] TC gui 9xxx</w:t>
-            </w:r>
-          </w:p>
-        </w:tc>
-        <w:tc>
-          <w:tcPr>
-            <w:tcW w:w="1247" w:type="dxa"/>
-          </w:tcPr>
-          <w:p>
-            <w:pPr>
-              <w:pStyle w:val="Compact"/>
-              <w:spacing w:after="40"/>
-              <w:jc w:val="left"/>
-            </w:pPr>
-            <w:r>
-              <w:rPr>
-                <w:sz w:val="19"/>
-              </w:rPr>
-              <w:t xml:space="preserve">132</w:t>
+            <w:tcW w:w="10145" w:type="dxa"/>
+          </w:tcPr>
+          <w:p>
+            <w:pPr>
+              <w:pStyle w:val="Compact"/>
+              <w:spacing w:after="40"/>
+              <w:jc w:val="left"/>
+            </w:pPr>
+            <w:r>
+              <w:rPr>
+                <w:sz w:val="19"/>
+              </w:rPr>
+              <w:t xml:space="preserve">(QC) Mua bảo hiểm xe máy một lần cho 3 năm, 198.000đ, khỏi phải nhớ gia hạn mỗi năm. Gói 3 năm được tặng thẻ nạp 50.000đ, tiền trừ thẳng vào tài khoản điện thoại: [LINK]. Không muốn nhận tin nữa, soạn TC gửi 9xxx.</w:t>
+            </w:r>
+          </w:p>
+        </w:tc>
+        <w:tc>
+          <w:tcPr>
+            <w:tcW w:w="1162" w:type="dxa"/>
+          </w:tcPr>
+          <w:p>
+            <w:pPr>
+              <w:pStyle w:val="Compact"/>
+              <w:spacing w:after="40"/>
+              <w:jc w:val="left"/>
+            </w:pPr>
+            <w:r>
+              <w:rPr>
+                <w:sz w:val="19"/>
+              </w:rPr>
+              <w:t xml:space="preserve">226</w:t>
+            </w:r>
+          </w:p>
+        </w:tc>
+        <w:tc>
+          <w:tcPr>
+            <w:tcW w:w="1162" w:type="dxa"/>
+          </w:tcPr>
+          <w:p>
+            <w:pPr>
+              <w:pStyle w:val="Compact"/>
+              <w:spacing w:after="40"/>
+              <w:jc w:val="left"/>
+            </w:pPr>
+            <w:r>
+              <w:rPr>
+                <w:sz w:val="19"/>
+              </w:rPr>
+              <w:t xml:space="preserve">4</w:t>
             </w:r>
           </w:p>
         </w:tc>
@@ -7868,7 +8064,7 @@
       <w:tr>
         <w:tc>
           <w:tcPr>
-            <w:tcW w:w="1247" w:type="dxa"/>
+            <w:tcW w:w="1162" w:type="dxa"/>
           </w:tcPr>
           <w:p>
             <w:pPr>
@@ -7888,7 +8084,7 @@
         </w:tc>
         <w:tc>
           <w:tcPr>
-            <w:tcW w:w="1411" w:type="dxa"/>
+            <w:tcW w:w="1162" w:type="dxa"/>
           </w:tcPr>
           <w:p>
             <w:pPr>
@@ -7906,38 +8102,55 @@
         </w:tc>
         <w:tc>
           <w:tcPr>
-            <w:tcW w:w="10889" w:type="dxa"/>
-          </w:tcPr>
-          <w:p>
-            <w:pPr>
-              <w:pStyle w:val="Compact"/>
-              <w:spacing w:after="40"/>
-              <w:jc w:val="left"/>
-            </w:pPr>
-            <w:r>
-              <w:rPr>
-                <w:rStyle w:val="VerbatimChar"/>
-                <w:sz w:val="19"/>
-              </w:rPr>
-              <w:t xml:space="preserve">(QC) Tai xe cong nghe: BH TNDS xe may la giay to bat buoc khi CSGT kiem tra. 66.000d/nam, tang 3GB data chay app ca tuan: [LINK] TC gui 9xxx</w:t>
-            </w:r>
-          </w:p>
-        </w:tc>
-        <w:tc>
-          <w:tcPr>
-            <w:tcW w:w="1247" w:type="dxa"/>
-          </w:tcPr>
-          <w:p>
-            <w:pPr>
-              <w:pStyle w:val="Compact"/>
-              <w:spacing w:after="40"/>
-              <w:jc w:val="left"/>
-            </w:pPr>
-            <w:r>
-              <w:rPr>
-                <w:sz w:val="19"/>
-              </w:rPr>
-              <w:t xml:space="preserve">153</w:t>
+            <w:tcW w:w="10145" w:type="dxa"/>
+          </w:tcPr>
+          <w:p>
+            <w:pPr>
+              <w:pStyle w:val="Compact"/>
+              <w:spacing w:after="40"/>
+              <w:jc w:val="left"/>
+            </w:pPr>
+            <w:r>
+              <w:rPr>
+                <w:sz w:val="19"/>
+              </w:rPr>
+              <w:t xml:space="preserve">(QC) Anh chị chạy xe công nghệ hay giao hàng thì bị CSGT dừng xe là phải xuất trình bảo hiểm xe máy. Mua trên điện thoại 66.000đ/năm, giấy chứng nhận điện tử mở ra là có. Tặng thêm 3GB data để chạy app: [LINK]. Không muốn nhận tin nữa, soạn TC gửi 9xxx.</w:t>
+            </w:r>
+          </w:p>
+        </w:tc>
+        <w:tc>
+          <w:tcPr>
+            <w:tcW w:w="1162" w:type="dxa"/>
+          </w:tcPr>
+          <w:p>
+            <w:pPr>
+              <w:pStyle w:val="Compact"/>
+              <w:spacing w:after="40"/>
+              <w:jc w:val="left"/>
+            </w:pPr>
+            <w:r>
+              <w:rPr>
+                <w:sz w:val="19"/>
+              </w:rPr>
+              <w:t xml:space="preserve">266</w:t>
+            </w:r>
+          </w:p>
+        </w:tc>
+        <w:tc>
+          <w:tcPr>
+            <w:tcW w:w="1162" w:type="dxa"/>
+          </w:tcPr>
+          <w:p>
+            <w:pPr>
+              <w:pStyle w:val="Compact"/>
+              <w:spacing w:after="40"/>
+              <w:jc w:val="left"/>
+            </w:pPr>
+            <w:r>
+              <w:rPr>
+                <w:sz w:val="19"/>
+              </w:rPr>
+              <w:t xml:space="preserve">4</w:t>
             </w:r>
           </w:p>
         </w:tc>
@@ -7970,10 +8183,11 @@
         <w:tblLayout w:type="fixed"/>
       </w:tblPr>
       <w:tblGrid>
-        <w:gridCol w:w="1197"/>
-        <w:gridCol w:w="1945"/>
-        <w:gridCol w:w="10454"/>
-        <w:gridCol w:w="1197"/>
+        <w:gridCol w:w="1108"/>
+        <w:gridCol w:w="1799"/>
+        <w:gridCol w:w="9671"/>
+        <w:gridCol w:w="1108"/>
+        <w:gridCol w:w="1108"/>
       </w:tblGrid>
       <w:tr>
         <w:trPr>
@@ -7981,7 +8195,7 @@
         </w:trPr>
         <w:tc>
           <w:tcPr>
-            <w:tcW w:w="1197" w:type="dxa"/>
+            <w:tcW w:w="1108" w:type="dxa"/>
             <w:shd w:val="clear" w:color="auto" w:fill="1F3864"/>
           </w:tcPr>
           <w:p>
@@ -8002,7 +8216,7 @@
         </w:tc>
         <w:tc>
           <w:tcPr>
-            <w:tcW w:w="1945" w:type="dxa"/>
+            <w:tcW w:w="1799" w:type="dxa"/>
             <w:shd w:val="clear" w:color="auto" w:fill="1F3864"/>
           </w:tcPr>
           <w:p>
@@ -8023,7 +8237,7 @@
         </w:tc>
         <w:tc>
           <w:tcPr>
-            <w:tcW w:w="10454" w:type="dxa"/>
+            <w:tcW w:w="9671" w:type="dxa"/>
             <w:shd w:val="clear" w:color="auto" w:fill="1F3864"/>
           </w:tcPr>
           <w:p>
@@ -8044,7 +8258,7 @@
         </w:tc>
         <w:tc>
           <w:tcPr>
-            <w:tcW w:w="1197" w:type="dxa"/>
+            <w:tcW w:w="1108" w:type="dxa"/>
             <w:shd w:val="clear" w:color="auto" w:fill="1F3864"/>
           </w:tcPr>
           <w:p>
@@ -8060,6 +8274,27 @@
                 <w:sz w:val="19"/>
               </w:rPr>
               <w:t xml:space="preserve">Ký tự</w:t>
+            </w:r>
+          </w:p>
+        </w:tc>
+        <w:tc>
+          <w:tcPr>
+            <w:tcW w:w="1108" w:type="dxa"/>
+            <w:shd w:val="clear" w:color="auto" w:fill="1F3864"/>
+          </w:tcPr>
+          <w:p>
+            <w:pPr>
+              <w:pStyle w:val="Compact"/>
+              <w:spacing w:after="40"/>
+              <w:jc w:val="left"/>
+            </w:pPr>
+            <w:r>
+              <w:rPr>
+                <w:b/>
+                <w:color w:val="FFFFFF"/>
+                <w:sz w:val="19"/>
+              </w:rPr>
+              <w:t xml:space="preserve">Số MT</w:t>
             </w:r>
           </w:p>
         </w:tc>
@@ -8067,7 +8302,7 @@
       <w:tr>
         <w:tc>
           <w:tcPr>
-            <w:tcW w:w="1197" w:type="dxa"/>
+            <w:tcW w:w="1108" w:type="dxa"/>
           </w:tcPr>
           <w:p>
             <w:pPr>
@@ -8087,7 +8322,7 @@
         </w:tc>
         <w:tc>
           <w:tcPr>
-            <w:tcW w:w="1945" w:type="dxa"/>
+            <w:tcW w:w="1799" w:type="dxa"/>
           </w:tcPr>
           <w:p>
             <w:pPr>
@@ -8105,38 +8340,55 @@
         </w:tc>
         <w:tc>
           <w:tcPr>
-            <w:tcW w:w="10454" w:type="dxa"/>
-          </w:tcPr>
-          <w:p>
-            <w:pPr>
-              <w:pStyle w:val="Compact"/>
-              <w:spacing w:after="40"/>
-              <w:jc w:val="left"/>
-            </w:pPr>
-            <w:r>
-              <w:rPr>
-                <w:rStyle w:val="VerbatimChar"/>
-                <w:sz w:val="19"/>
-              </w:rPr>
-              <w:t xml:space="preserve">(QC) 12h-13h hom nay: 200 khach dau tien mua BH xe may 66.000d duoc tang the cao 20.000d. Mua ngay: [LINK] TC gui 9xxx</w:t>
-            </w:r>
-          </w:p>
-        </w:tc>
-        <w:tc>
-          <w:tcPr>
-            <w:tcW w:w="1197" w:type="dxa"/>
-          </w:tcPr>
-          <w:p>
-            <w:pPr>
-              <w:pStyle w:val="Compact"/>
-              <w:spacing w:after="40"/>
-              <w:jc w:val="left"/>
-            </w:pPr>
-            <w:r>
-              <w:rPr>
-                <w:sz w:val="19"/>
-              </w:rPr>
-              <w:t xml:space="preserve">131</w:t>
+            <w:tcW w:w="9671" w:type="dxa"/>
+          </w:tcPr>
+          <w:p>
+            <w:pPr>
+              <w:pStyle w:val="Compact"/>
+              <w:spacing w:after="40"/>
+              <w:jc w:val="left"/>
+            </w:pPr>
+            <w:r>
+              <w:rPr>
+                <w:sz w:val="19"/>
+              </w:rPr>
+              <w:t xml:space="preserve">(QC) Trưa nay từ 12h đến 13h, 200 người mua bảo hiểm xe máy đầu tiên được nạp 20.000đ vào tài khoản. Bảo hiểm 66.000đ/năm, mua 2 phút là xong: [LINK]. Không muốn nhận tin nữa, soạn TC gửi 9xxx.</w:t>
+            </w:r>
+          </w:p>
+        </w:tc>
+        <w:tc>
+          <w:tcPr>
+            <w:tcW w:w="1108" w:type="dxa"/>
+          </w:tcPr>
+          <w:p>
+            <w:pPr>
+              <w:pStyle w:val="Compact"/>
+              <w:spacing w:after="40"/>
+              <w:jc w:val="left"/>
+            </w:pPr>
+            <w:r>
+              <w:rPr>
+                <w:sz w:val="19"/>
+              </w:rPr>
+              <w:t xml:space="preserve">206</w:t>
+            </w:r>
+          </w:p>
+        </w:tc>
+        <w:tc>
+          <w:tcPr>
+            <w:tcW w:w="1108" w:type="dxa"/>
+          </w:tcPr>
+          <w:p>
+            <w:pPr>
+              <w:pStyle w:val="Compact"/>
+              <w:spacing w:after="40"/>
+              <w:jc w:val="left"/>
+            </w:pPr>
+            <w:r>
+              <w:rPr>
+                <w:sz w:val="19"/>
+              </w:rPr>
+              <w:t xml:space="preserve">4</w:t>
             </w:r>
           </w:p>
         </w:tc>
@@ -8144,7 +8396,7 @@
       <w:tr>
         <w:tc>
           <w:tcPr>
-            <w:tcW w:w="1197" w:type="dxa"/>
+            <w:tcW w:w="1108" w:type="dxa"/>
           </w:tcPr>
           <w:p>
             <w:pPr>
@@ -8164,7 +8416,7 @@
         </w:tc>
         <w:tc>
           <w:tcPr>
-            <w:tcW w:w="1945" w:type="dxa"/>
+            <w:tcW w:w="1799" w:type="dxa"/>
           </w:tcPr>
           <w:p>
             <w:pPr>
@@ -8182,38 +8434,55 @@
         </w:tc>
         <w:tc>
           <w:tcPr>
-            <w:tcW w:w="10454" w:type="dxa"/>
-          </w:tcPr>
-          <w:p>
-            <w:pPr>
-              <w:pStyle w:val="Compact"/>
-              <w:spacing w:after="40"/>
-              <w:jc w:val="left"/>
-            </w:pPr>
-            <w:r>
-              <w:rPr>
-                <w:rStyle w:val="VerbatimChar"/>
-                <w:sz w:val="19"/>
-              </w:rPr>
-              <w:t xml:space="preserve">(QC) Moi ban be mua BH xe may qua link cua ban: ca 2 nguoi deu nhan 2GB data. Link cua ban: [LINK] TC gui 9xxx</w:t>
-            </w:r>
-          </w:p>
-        </w:tc>
-        <w:tc>
-          <w:tcPr>
-            <w:tcW w:w="1197" w:type="dxa"/>
-          </w:tcPr>
-          <w:p>
-            <w:pPr>
-              <w:pStyle w:val="Compact"/>
-              <w:spacing w:after="40"/>
-              <w:jc w:val="left"/>
-            </w:pPr>
-            <w:r>
-              <w:rPr>
-                <w:sz w:val="19"/>
-              </w:rPr>
-              <w:t xml:space="preserve">123</w:t>
+            <w:tcW w:w="9671" w:type="dxa"/>
+          </w:tcPr>
+          <w:p>
+            <w:pPr>
+              <w:pStyle w:val="Compact"/>
+              <w:spacing w:after="40"/>
+              <w:jc w:val="left"/>
+            </w:pPr>
+            <w:r>
+              <w:rPr>
+                <w:sz w:val="19"/>
+              </w:rPr>
+              <w:t xml:space="preserve">(QC) Cảm ơn bạn đã mua bảo hiểm xe máy. Bạn gửi link này cho bạn bè, người nhà, ai mua qua link thì cả hai người đều được 2GB data: [LINK]. Không muốn nhận tin nữa, soạn TC gửi 9xxx.</w:t>
+            </w:r>
+          </w:p>
+        </w:tc>
+        <w:tc>
+          <w:tcPr>
+            <w:tcW w:w="1108" w:type="dxa"/>
+          </w:tcPr>
+          <w:p>
+            <w:pPr>
+              <w:pStyle w:val="Compact"/>
+              <w:spacing w:after="40"/>
+              <w:jc w:val="left"/>
+            </w:pPr>
+            <w:r>
+              <w:rPr>
+                <w:sz w:val="19"/>
+              </w:rPr>
+              <w:t xml:space="preserve">195</w:t>
+            </w:r>
+          </w:p>
+        </w:tc>
+        <w:tc>
+          <w:tcPr>
+            <w:tcW w:w="1108" w:type="dxa"/>
+          </w:tcPr>
+          <w:p>
+            <w:pPr>
+              <w:pStyle w:val="Compact"/>
+              <w:spacing w:after="40"/>
+              <w:jc w:val="left"/>
+            </w:pPr>
+            <w:r>
+              <w:rPr>
+                <w:sz w:val="19"/>
+              </w:rPr>
+              <w:t xml:space="preserve">3</w:t>
             </w:r>
           </w:p>
         </w:tc>
@@ -8221,7 +8490,7 @@
       <w:tr>
         <w:tc>
           <w:tcPr>
-            <w:tcW w:w="1197" w:type="dxa"/>
+            <w:tcW w:w="1108" w:type="dxa"/>
           </w:tcPr>
           <w:p>
             <w:pPr>
@@ -8241,7 +8510,7 @@
         </w:tc>
         <w:tc>
           <w:tcPr>
-            <w:tcW w:w="1945" w:type="dxa"/>
+            <w:tcW w:w="1799" w:type="dxa"/>
           </w:tcPr>
           <w:p>
             <w:pPr>
@@ -8259,38 +8528,55 @@
         </w:tc>
         <w:tc>
           <w:tcPr>
-            <w:tcW w:w="10454" w:type="dxa"/>
-          </w:tcPr>
-          <w:p>
-            <w:pPr>
-              <w:pStyle w:val="Compact"/>
-              <w:spacing w:after="40"/>
-              <w:jc w:val="left"/>
-            </w:pPr>
-            <w:r>
-              <w:rPr>
-                <w:rStyle w:val="VerbatimChar"/>
-                <w:sz w:val="19"/>
-              </w:rPr>
-              <w:t xml:space="preserve">(QC) BH xe may cua ban sap het han ngay [DD/MM]. Gia han som 66.000d, nhan ngay 3GB data. Tru vao TK dien thoai: [LINK] TC gui 9xxx</w:t>
-            </w:r>
-          </w:p>
-        </w:tc>
-        <w:tc>
-          <w:tcPr>
-            <w:tcW w:w="1197" w:type="dxa"/>
-          </w:tcPr>
-          <w:p>
-            <w:pPr>
-              <w:pStyle w:val="Compact"/>
-              <w:spacing w:after="40"/>
-              <w:jc w:val="left"/>
-            </w:pPr>
-            <w:r>
-              <w:rPr>
-                <w:sz w:val="19"/>
-              </w:rPr>
-              <w:t xml:space="preserve">144</w:t>
+            <w:tcW w:w="9671" w:type="dxa"/>
+          </w:tcPr>
+          <w:p>
+            <w:pPr>
+              <w:pStyle w:val="Compact"/>
+              <w:spacing w:after="40"/>
+              <w:jc w:val="left"/>
+            </w:pPr>
+            <w:r>
+              <w:rPr>
+                <w:sz w:val="19"/>
+              </w:rPr>
+              <w:t xml:space="preserve">(QC) Bảo hiểm xe máy của xe [BIỂN SỐ] hết hạn ngày [DD/MM]. Bạn gia hạn từ bây giờ để không bị hở ngày nào, giá vẫn 66.000đ, được tặng thêm 3GB data: [LINK]. Không muốn nhận tin nữa, soạn TC gửi 9xxx.</w:t>
+            </w:r>
+          </w:p>
+        </w:tc>
+        <w:tc>
+          <w:tcPr>
+            <w:tcW w:w="1108" w:type="dxa"/>
+          </w:tcPr>
+          <w:p>
+            <w:pPr>
+              <w:pStyle w:val="Compact"/>
+              <w:spacing w:after="40"/>
+              <w:jc w:val="left"/>
+            </w:pPr>
+            <w:r>
+              <w:rPr>
+                <w:sz w:val="19"/>
+              </w:rPr>
+              <w:t xml:space="preserve">213</w:t>
+            </w:r>
+          </w:p>
+        </w:tc>
+        <w:tc>
+          <w:tcPr>
+            <w:tcW w:w="1108" w:type="dxa"/>
+          </w:tcPr>
+          <w:p>
+            <w:pPr>
+              <w:pStyle w:val="Compact"/>
+              <w:spacing w:after="40"/>
+              <w:jc w:val="left"/>
+            </w:pPr>
+            <w:r>
+              <w:rPr>
+                <w:sz w:val="19"/>
+              </w:rPr>
+              <w:t xml:space="preserve">4</w:t>
             </w:r>
           </w:p>
         </w:tc>
@@ -8298,7 +8584,7 @@
       <w:tr>
         <w:tc>
           <w:tcPr>
-            <w:tcW w:w="1197" w:type="dxa"/>
+            <w:tcW w:w="1108" w:type="dxa"/>
           </w:tcPr>
           <w:p>
             <w:pPr>
@@ -8318,7 +8604,7 @@
         </w:tc>
         <w:tc>
           <w:tcPr>
-            <w:tcW w:w="1945" w:type="dxa"/>
+            <w:tcW w:w="1799" w:type="dxa"/>
           </w:tcPr>
           <w:p>
             <w:pPr>
@@ -8336,38 +8622,55 @@
         </w:tc>
         <w:tc>
           <w:tcPr>
-            <w:tcW w:w="10454" w:type="dxa"/>
-          </w:tcPr>
-          <w:p>
-            <w:pPr>
-              <w:pStyle w:val="Compact"/>
-              <w:spacing w:after="40"/>
-              <w:jc w:val="left"/>
-            </w:pPr>
-            <w:r>
-              <w:rPr>
-                <w:rStyle w:val="VerbatimChar"/>
-                <w:sz w:val="19"/>
-              </w:rPr>
-              <w:t xml:space="preserve">(QC) Combo BH xe may + tai nan nguoi ngoi tren xe chi 96.000d/nam, tang goi data 30 ngay. Mua 2 phut: [LINK] TC gui 9xxx</w:t>
-            </w:r>
-          </w:p>
-        </w:tc>
-        <w:tc>
-          <w:tcPr>
-            <w:tcW w:w="1197" w:type="dxa"/>
-          </w:tcPr>
-          <w:p>
-            <w:pPr>
-              <w:pStyle w:val="Compact"/>
-              <w:spacing w:after="40"/>
-              <w:jc w:val="left"/>
-            </w:pPr>
-            <w:r>
-              <w:rPr>
-                <w:sz w:val="19"/>
-              </w:rPr>
-              <w:t xml:space="preserve">133</w:t>
+            <w:tcW w:w="9671" w:type="dxa"/>
+          </w:tcPr>
+          <w:p>
+            <w:pPr>
+              <w:pStyle w:val="Compact"/>
+              <w:spacing w:after="40"/>
+              <w:jc w:val="left"/>
+            </w:pPr>
+            <w:r>
+              <w:rPr>
+                <w:sz w:val="19"/>
+              </w:rPr>
+              <w:t xml:space="preserve">(QC) Bảo hiểm bắt buộc chủ yếu đền cho người khác khi bạn gây tai nạn. Còn bạn và người ngồi sau thì cần thêm bảo hiểm tai nạn. Gói cả hai 96.000đ/năm, tặng data dùng 30 ngày: [LINK]. Không muốn nhận tin nữa, soạn TC gửi 9xxx.</w:t>
+            </w:r>
+          </w:p>
+        </w:tc>
+        <w:tc>
+          <w:tcPr>
+            <w:tcW w:w="1108" w:type="dxa"/>
+          </w:tcPr>
+          <w:p>
+            <w:pPr>
+              <w:pStyle w:val="Compact"/>
+              <w:spacing w:after="40"/>
+              <w:jc w:val="left"/>
+            </w:pPr>
+            <w:r>
+              <w:rPr>
+                <w:sz w:val="19"/>
+              </w:rPr>
+              <w:t xml:space="preserve">239</w:t>
+            </w:r>
+          </w:p>
+        </w:tc>
+        <w:tc>
+          <w:tcPr>
+            <w:tcW w:w="1108" w:type="dxa"/>
+          </w:tcPr>
+          <w:p>
+            <w:pPr>
+              <w:pStyle w:val="Compact"/>
+              <w:spacing w:after="40"/>
+              <w:jc w:val="left"/>
+            </w:pPr>
+            <w:r>
+              <w:rPr>
+                <w:sz w:val="19"/>
+              </w:rPr>
+              <w:t xml:space="preserve">4</w:t>
             </w:r>
           </w:p>
         </w:tc>
@@ -8375,7 +8678,7 @@
       <w:tr>
         <w:tc>
           <w:tcPr>
-            <w:tcW w:w="1197" w:type="dxa"/>
+            <w:tcW w:w="1108" w:type="dxa"/>
           </w:tcPr>
           <w:p>
             <w:pPr>
@@ -8395,7 +8698,7 @@
         </w:tc>
         <w:tc>
           <w:tcPr>
-            <w:tcW w:w="1945" w:type="dxa"/>
+            <w:tcW w:w="1799" w:type="dxa"/>
           </w:tcPr>
           <w:p>
             <w:pPr>
@@ -8413,38 +8716,55 @@
         </w:tc>
         <w:tc>
           <w:tcPr>
-            <w:tcW w:w="10454" w:type="dxa"/>
-          </w:tcPr>
-          <w:p>
-            <w:pPr>
-              <w:pStyle w:val="Compact"/>
-              <w:spacing w:after="40"/>
-              <w:jc w:val="left"/>
-            </w:pPr>
-            <w:r>
-              <w:rPr>
-                <w:rStyle w:val="VerbatimChar"/>
-                <w:sz w:val="19"/>
-              </w:rPr>
-              <w:t xml:space="preserve">(QC) Tet nay CSGT tang cuong kiem tra. BH xe may cua ban con han khong? 66.000d/nam, tang 3GB data: [LINK] TC gui 9xxx</w:t>
-            </w:r>
-          </w:p>
-        </w:tc>
-        <w:tc>
-          <w:tcPr>
-            <w:tcW w:w="1197" w:type="dxa"/>
-          </w:tcPr>
-          <w:p>
-            <w:pPr>
-              <w:pStyle w:val="Compact"/>
-              <w:spacing w:after="40"/>
-              <w:jc w:val="left"/>
-            </w:pPr>
-            <w:r>
-              <w:rPr>
-                <w:sz w:val="19"/>
-              </w:rPr>
-              <w:t xml:space="preserve">131</w:t>
+            <w:tcW w:w="9671" w:type="dxa"/>
+          </w:tcPr>
+          <w:p>
+            <w:pPr>
+              <w:pStyle w:val="Compact"/>
+              <w:spacing w:after="40"/>
+              <w:jc w:val="left"/>
+            </w:pPr>
+            <w:r>
+              <w:rPr>
+                <w:sz w:val="19"/>
+              </w:rPr>
+              <w:t xml:space="preserve">(QC) Gần Tết CSGT kiểm tra giấy tờ nhiều hơn. Bạn xem lại bảo hiểm xe máy còn hạn không nhé. Hết rồi thì mua lại 66.000đ trên điện thoại, có giấy điện tử ngay, tặng 3GB data: [LINK]. Không muốn nhận tin nữa, soạn TC gửi 9xxx.</w:t>
+            </w:r>
+          </w:p>
+        </w:tc>
+        <w:tc>
+          <w:tcPr>
+            <w:tcW w:w="1108" w:type="dxa"/>
+          </w:tcPr>
+          <w:p>
+            <w:pPr>
+              <w:pStyle w:val="Compact"/>
+              <w:spacing w:after="40"/>
+              <w:jc w:val="left"/>
+            </w:pPr>
+            <w:r>
+              <w:rPr>
+                <w:sz w:val="19"/>
+              </w:rPr>
+              <w:t xml:space="preserve">238</w:t>
+            </w:r>
+          </w:p>
+        </w:tc>
+        <w:tc>
+          <w:tcPr>
+            <w:tcW w:w="1108" w:type="dxa"/>
+          </w:tcPr>
+          <w:p>
+            <w:pPr>
+              <w:pStyle w:val="Compact"/>
+              <w:spacing w:after="40"/>
+              <w:jc w:val="left"/>
+            </w:pPr>
+            <w:r>
+              <w:rPr>
+                <w:sz w:val="19"/>
+              </w:rPr>
+              <w:t xml:space="preserve">4</w:t>
             </w:r>
           </w:p>
         </w:tc>
@@ -8452,7 +8772,7 @@
       <w:tr>
         <w:tc>
           <w:tcPr>
-            <w:tcW w:w="1197" w:type="dxa"/>
+            <w:tcW w:w="1108" w:type="dxa"/>
           </w:tcPr>
           <w:p>
             <w:pPr>
@@ -8472,7 +8792,7 @@
         </w:tc>
         <w:tc>
           <w:tcPr>
-            <w:tcW w:w="1945" w:type="dxa"/>
+            <w:tcW w:w="1799" w:type="dxa"/>
           </w:tcPr>
           <w:p>
             <w:pPr>
@@ -8490,38 +8810,55 @@
         </w:tc>
         <w:tc>
           <w:tcPr>
-            <w:tcW w:w="10454" w:type="dxa"/>
-          </w:tcPr>
-          <w:p>
-            <w:pPr>
-              <w:pStyle w:val="Compact"/>
-              <w:spacing w:after="40"/>
-              <w:jc w:val="left"/>
-            </w:pPr>
-            <w:r>
-              <w:rPr>
-                <w:rStyle w:val="VerbatimChar"/>
-                <w:sz w:val="19"/>
-              </w:rPr>
-              <w:t xml:space="preserve">(QC) Ve que an Tet bang xe may? Mua BH TNDS 66.000d/nam, nhan ma du thuong trung the 500.000d. Mua ngay: [LINK] TC gui 9xxx</w:t>
-            </w:r>
-          </w:p>
-        </w:tc>
-        <w:tc>
-          <w:tcPr>
-            <w:tcW w:w="1197" w:type="dxa"/>
-          </w:tcPr>
-          <w:p>
-            <w:pPr>
-              <w:pStyle w:val="Compact"/>
-              <w:spacing w:after="40"/>
-              <w:jc w:val="left"/>
-            </w:pPr>
-            <w:r>
-              <w:rPr>
-                <w:sz w:val="19"/>
-              </w:rPr>
-              <w:t xml:space="preserve">136</w:t>
+            <w:tcW w:w="9671" w:type="dxa"/>
+          </w:tcPr>
+          <w:p>
+            <w:pPr>
+              <w:pStyle w:val="Compact"/>
+              <w:spacing w:after="40"/>
+              <w:jc w:val="left"/>
+            </w:pPr>
+            <w:r>
+              <w:rPr>
+                <w:sz w:val="19"/>
+              </w:rPr>
+              <w:t xml:space="preserve">(QC) Tết này chạy xe về quê thì mua bảo hiểm xe máy trước khi đi nhé. Mỗi đơn 66.000đ được một mã dự thưởng, tuần nào cũng quay 10 thẻ nạp 500.000đ: [LINK]. Không muốn nhận tin nữa, soạn TC gửi 9xxx.</w:t>
+            </w:r>
+          </w:p>
+        </w:tc>
+        <w:tc>
+          <w:tcPr>
+            <w:tcW w:w="1108" w:type="dxa"/>
+          </w:tcPr>
+          <w:p>
+            <w:pPr>
+              <w:pStyle w:val="Compact"/>
+              <w:spacing w:after="40"/>
+              <w:jc w:val="left"/>
+            </w:pPr>
+            <w:r>
+              <w:rPr>
+                <w:sz w:val="19"/>
+              </w:rPr>
+              <w:t xml:space="preserve">212</w:t>
+            </w:r>
+          </w:p>
+        </w:tc>
+        <w:tc>
+          <w:tcPr>
+            <w:tcW w:w="1108" w:type="dxa"/>
+          </w:tcPr>
+          <w:p>
+            <w:pPr>
+              <w:pStyle w:val="Compact"/>
+              <w:spacing w:after="40"/>
+              <w:jc w:val="left"/>
+            </w:pPr>
+            <w:r>
+              <w:rPr>
+                <w:sz w:val="19"/>
+              </w:rPr>
+              <w:t xml:space="preserve">4</w:t>
             </w:r>
           </w:p>
         </w:tc>
@@ -8536,13 +8873,13 @@
       </w:r>
     </w:p>
     <w:bookmarkEnd w:id="38"/>
-    <w:bookmarkStart w:id="39" w:name="X7aae425bb3bfa450e6d82e5b666113081255e30"/>
+    <w:bookmarkStart w:id="39" w:name="X5cb675f72543dad7110237d8871bb8cdad610c3"/>
     <w:p>
       <w:pPr>
         <w:pStyle w:val="Heading3"/>
       </w:pPr>
       <w:r>
-        <w:t xml:space="preserve">6.4 Tin giao dịch sau mua (không phải QC, không cần nhãn/từ chối)</w:t>
+        <w:t xml:space="preserve">6.4 Tin giao dịch sau khi mua (không phải QC, không cần nhãn/từ chối)</w:t>
       </w:r>
     </w:p>
     <w:tbl>
@@ -8562,10 +8899,11 @@
         <w:tblLayout w:type="fixed"/>
       </w:tblPr>
       <w:tblGrid>
-        <w:gridCol w:w="1075"/>
-        <w:gridCol w:w="3260"/>
-        <w:gridCol w:w="9385"/>
-        <w:gridCol w:w="1075"/>
+        <w:gridCol w:w="1002"/>
+        <w:gridCol w:w="3039"/>
+        <w:gridCol w:w="8749"/>
+        <w:gridCol w:w="1002"/>
+        <w:gridCol w:w="1002"/>
       </w:tblGrid>
       <w:tr>
         <w:trPr>
@@ -8573,7 +8911,7 @@
         </w:trPr>
         <w:tc>
           <w:tcPr>
-            <w:tcW w:w="1075" w:type="dxa"/>
+            <w:tcW w:w="1002" w:type="dxa"/>
             <w:shd w:val="clear" w:color="auto" w:fill="1F3864"/>
           </w:tcPr>
           <w:p>
@@ -8594,7 +8932,7 @@
         </w:tc>
         <w:tc>
           <w:tcPr>
-            <w:tcW w:w="3260" w:type="dxa"/>
+            <w:tcW w:w="3039" w:type="dxa"/>
             <w:shd w:val="clear" w:color="auto" w:fill="1F3864"/>
           </w:tcPr>
           <w:p>
@@ -8615,7 +8953,7 @@
         </w:tc>
         <w:tc>
           <w:tcPr>
-            <w:tcW w:w="9385" w:type="dxa"/>
+            <w:tcW w:w="8749" w:type="dxa"/>
             <w:shd w:val="clear" w:color="auto" w:fill="1F3864"/>
           </w:tcPr>
           <w:p>
@@ -8636,7 +8974,7 @@
         </w:tc>
         <w:tc>
           <w:tcPr>
-            <w:tcW w:w="1075" w:type="dxa"/>
+            <w:tcW w:w="1002" w:type="dxa"/>
             <w:shd w:val="clear" w:color="auto" w:fill="1F3864"/>
           </w:tcPr>
           <w:p>
@@ -8652,6 +8990,27 @@
                 <w:sz w:val="19"/>
               </w:rPr>
               <w:t xml:space="preserve">Ký tự</w:t>
+            </w:r>
+          </w:p>
+        </w:tc>
+        <w:tc>
+          <w:tcPr>
+            <w:tcW w:w="1002" w:type="dxa"/>
+            <w:shd w:val="clear" w:color="auto" w:fill="1F3864"/>
+          </w:tcPr>
+          <w:p>
+            <w:pPr>
+              <w:pStyle w:val="Compact"/>
+              <w:spacing w:after="40"/>
+              <w:jc w:val="left"/>
+            </w:pPr>
+            <w:r>
+              <w:rPr>
+                <w:b/>
+                <w:color w:val="FFFFFF"/>
+                <w:sz w:val="19"/>
+              </w:rPr>
+              <w:t xml:space="preserve">Số MT</w:t>
             </w:r>
           </w:p>
         </w:tc>
@@ -8659,7 +9018,7 @@
       <w:tr>
         <w:tc>
           <w:tcPr>
-            <w:tcW w:w="1075" w:type="dxa"/>
+            <w:tcW w:w="1002" w:type="dxa"/>
           </w:tcPr>
           <w:p>
             <w:pPr>
@@ -8679,7 +9038,7 @@
         </w:tc>
         <w:tc>
           <w:tcPr>
-            <w:tcW w:w="3260" w:type="dxa"/>
+            <w:tcW w:w="3039" w:type="dxa"/>
           </w:tcPr>
           <w:p>
             <w:pPr>
@@ -8697,38 +9056,55 @@
         </w:tc>
         <w:tc>
           <w:tcPr>
-            <w:tcW w:w="9385" w:type="dxa"/>
-          </w:tcPr>
-          <w:p>
-            <w:pPr>
-              <w:pStyle w:val="Compact"/>
-              <w:spacing w:after="40"/>
-              <w:jc w:val="left"/>
-            </w:pPr>
-            <w:r>
-              <w:rPr>
-                <w:rStyle w:val="VerbatimChar"/>
-                <w:sz w:val="19"/>
-              </w:rPr>
-              <w:t xml:space="preserve">Cam on ban da mua BH TNDS xe may [BIEN SO], hieu luc [tu]-[den]. Chung nhan dien tu: [LINK]. Qua 3GB data da duoc cong. CSKH 19001557</w:t>
-            </w:r>
-          </w:p>
-        </w:tc>
-        <w:tc>
-          <w:tcPr>
-            <w:tcW w:w="1075" w:type="dxa"/>
-          </w:tcPr>
-          <w:p>
-            <w:pPr>
-              <w:pStyle w:val="Compact"/>
-              <w:spacing w:after="40"/>
-              <w:jc w:val="left"/>
-            </w:pPr>
-            <w:r>
-              <w:rPr>
-                <w:sz w:val="19"/>
-              </w:rPr>
-              <w:t xml:space="preserve">~146</w:t>
+            <w:tcW w:w="8749" w:type="dxa"/>
+          </w:tcPr>
+          <w:p>
+            <w:pPr>
+              <w:pStyle w:val="Compact"/>
+              <w:spacing w:after="40"/>
+              <w:jc w:val="left"/>
+            </w:pPr>
+            <w:r>
+              <w:rPr>
+                <w:sz w:val="19"/>
+              </w:rPr>
+              <w:t xml:space="preserve">Bạn đã mua xong bảo hiểm xe máy cho xe [BIỂN SỐ], hiệu lực từ [ngày] đến [ngày]. Giấy chứng nhận điện tử ở đây: [LINK]. 3GB data đã được cộng vào tài khoản. Cần hỗ trợ thì gọi 19001557.</w:t>
+            </w:r>
+          </w:p>
+        </w:tc>
+        <w:tc>
+          <w:tcPr>
+            <w:tcW w:w="1002" w:type="dxa"/>
+          </w:tcPr>
+          <w:p>
+            <w:pPr>
+              <w:pStyle w:val="Compact"/>
+              <w:spacing w:after="40"/>
+              <w:jc w:val="left"/>
+            </w:pPr>
+            <w:r>
+              <w:rPr>
+                <w:sz w:val="19"/>
+              </w:rPr>
+              <w:t xml:space="preserve">198</w:t>
+            </w:r>
+          </w:p>
+        </w:tc>
+        <w:tc>
+          <w:tcPr>
+            <w:tcW w:w="1002" w:type="dxa"/>
+          </w:tcPr>
+          <w:p>
+            <w:pPr>
+              <w:pStyle w:val="Compact"/>
+              <w:spacing w:after="40"/>
+              <w:jc w:val="left"/>
+            </w:pPr>
+            <w:r>
+              <w:rPr>
+                <w:sz w:val="19"/>
+              </w:rPr>
+              <w:t xml:space="preserve">3</w:t>
             </w:r>
           </w:p>
         </w:tc>
@@ -8736,7 +9112,7 @@
       <w:tr>
         <w:tc>
           <w:tcPr>
-            <w:tcW w:w="1075" w:type="dxa"/>
+            <w:tcW w:w="1002" w:type="dxa"/>
           </w:tcPr>
           <w:p>
             <w:pPr>
@@ -8756,7 +9132,7 @@
         </w:tc>
         <w:tc>
           <w:tcPr>
-            <w:tcW w:w="3260" w:type="dxa"/>
+            <w:tcW w:w="3039" w:type="dxa"/>
           </w:tcPr>
           <w:p>
             <w:pPr>
@@ -8774,51 +9150,68 @@
         </w:tc>
         <w:tc>
           <w:tcPr>
-            <w:tcW w:w="9385" w:type="dxa"/>
-          </w:tcPr>
-          <w:p>
-            <w:pPr>
-              <w:pStyle w:val="Compact"/>
-              <w:spacing w:after="40"/>
-              <w:jc w:val="left"/>
-            </w:pPr>
-            <w:r>
-              <w:rPr>
-                <w:rStyle w:val="VerbatimChar"/>
-                <w:sz w:val="19"/>
-              </w:rPr>
-              <w:t xml:space="preserve">Giu chung nhan BH xe may tren dien thoai: chup man hinh hoac luu link [LINK]. Khi CSGT kiem tra chi can xuat trinh tren dien thoai.</w:t>
-            </w:r>
-          </w:p>
-        </w:tc>
-        <w:tc>
-          <w:tcPr>
-            <w:tcW w:w="1075" w:type="dxa"/>
-          </w:tcPr>
-          <w:p>
-            <w:pPr>
-              <w:pStyle w:val="Compact"/>
-              <w:spacing w:after="40"/>
-              <w:jc w:val="left"/>
-            </w:pPr>
-            <w:r>
-              <w:rPr>
-                <w:sz w:val="19"/>
-              </w:rPr>
-              <w:t xml:space="preserve">144</w:t>
+            <w:tcW w:w="8749" w:type="dxa"/>
+          </w:tcPr>
+          <w:p>
+            <w:pPr>
+              <w:pStyle w:val="Compact"/>
+              <w:spacing w:after="40"/>
+              <w:jc w:val="left"/>
+            </w:pPr>
+            <w:r>
+              <w:rPr>
+                <w:sz w:val="19"/>
+              </w:rPr>
+              <w:t xml:space="preserve">Mẹo nhỏ: bạn chụp màn hình giấy chứng nhận hoặc lưu link [LINK] lại. Khi CSGT kiểm tra chỉ cần mở trên điện thoại, không cần bản giấy.</w:t>
+            </w:r>
+          </w:p>
+        </w:tc>
+        <w:tc>
+          <w:tcPr>
+            <w:tcW w:w="1002" w:type="dxa"/>
+          </w:tcPr>
+          <w:p>
+            <w:pPr>
+              <w:pStyle w:val="Compact"/>
+              <w:spacing w:after="40"/>
+              <w:jc w:val="left"/>
+            </w:pPr>
+            <w:r>
+              <w:rPr>
+                <w:sz w:val="19"/>
+              </w:rPr>
+              <w:t xml:space="preserve">147</w:t>
+            </w:r>
+          </w:p>
+        </w:tc>
+        <w:tc>
+          <w:tcPr>
+            <w:tcW w:w="1002" w:type="dxa"/>
+          </w:tcPr>
+          <w:p>
+            <w:pPr>
+              <w:pStyle w:val="Compact"/>
+              <w:spacing w:after="40"/>
+              <w:jc w:val="left"/>
+            </w:pPr>
+            <w:r>
+              <w:rPr>
+                <w:sz w:val="19"/>
+              </w:rPr>
+              <w:t xml:space="preserve">3</w:t>
             </w:r>
           </w:p>
         </w:tc>
       </w:tr>
     </w:tbl>
     <w:bookmarkEnd w:id="39"/>
-    <w:bookmarkStart w:id="40" w:name="X88f006f60d5d6543d3362ba922e39025bb2053f"/>
+    <w:bookmarkStart w:id="40" w:name="X13ac9cabb373071cd74cdb2d4b6ad21030abbca"/>
     <w:p>
       <w:pPr>
         <w:pStyle w:val="Heading3"/>
       </w:pPr>
       <w:r>
-        <w:t xml:space="preserve">6.5 Tin trả lời cú pháp (MO → MT)</w:t>
+        <w:t xml:space="preserve">6.5 Tin trả lời khi khách soạn cú pháp (MO → MT)</w:t>
       </w:r>
     </w:p>
     <w:tbl>
@@ -8902,6 +9295,8 @@
             <w:r>
               <w:rPr>
                 <w:rStyle w:val="VerbatimChar"/>
+                <w:bCs/>
+                <w:b/>
                 <w:sz w:val="19"/>
               </w:rPr>
               <w:t xml:space="preserve">BH &lt;biển số&gt;</w:t>
@@ -8920,10 +9315,9 @@
             </w:pPr>
             <w:r>
               <w:rPr>
-                <w:rStyle w:val="VerbatimChar"/>
-                <w:sz w:val="19"/>
-              </w:rPr>
-              <w:t xml:space="preserve">Xac nhan mua BH TNDS xe may [BIEN SO] 1 nam, 66.000d tru vao TK. Soan Y gui 9xxx de dong y trong 10 phut. Huy: bo qua tin nay.</w:t>
+                <w:sz w:val="19"/>
+              </w:rPr>
+              <w:t xml:space="preserve">Bạn đang mua bảo hiểm xe máy 1 năm cho xe [BIỂN SỐ], phí 66.000đ trừ vào tài khoản. Đồng ý thì soạn Y gửi 9xxx trong vòng 10 phút. Không mua thì bạn cứ bỏ qua tin này.</w:t>
             </w:r>
           </w:p>
         </w:tc>
@@ -8942,6 +9336,8 @@
             <w:r>
               <w:rPr>
                 <w:rStyle w:val="VerbatimChar"/>
+                <w:bCs/>
+                <w:b/>
                 <w:sz w:val="19"/>
               </w:rPr>
               <w:t xml:space="preserve">Y</w:t>
@@ -8980,6 +9376,8 @@
             </w:pPr>
             <w:r>
               <w:rPr>
+                <w:bCs/>
+                <w:b/>
                 <w:sz w:val="19"/>
               </w:rPr>
               <w:t xml:space="preserve">Sai cú pháp</w:t>
@@ -8998,10 +9396,9 @@
             </w:pPr>
             <w:r>
               <w:rPr>
-                <w:rStyle w:val="VerbatimChar"/>
-                <w:sz w:val="19"/>
-              </w:rPr>
-              <w:t xml:space="preserve">Cu phap chua dung. Soan BH [bien so], vi du: BH 29X112345 gui 9xxx. CSKH 19001557</w:t>
+                <w:sz w:val="19"/>
+              </w:rPr>
+              <w:t xml:space="preserve">Tin nhắn chưa đúng cú pháp. Bạn soạn BH dấu cách biển số, ví dụ BH 29X112345, rồi gửi 9xxx. Cần hỗ trợ thì gọi 19001557.</w:t>
             </w:r>
           </w:p>
         </w:tc>
@@ -9020,6 +9417,8 @@
             <w:r>
               <w:rPr>
                 <w:rStyle w:val="VerbatimChar"/>
+                <w:bCs/>
+                <w:b/>
                 <w:sz w:val="19"/>
               </w:rPr>
               <w:t xml:space="preserve">TC</w:t>
@@ -9038,22 +9437,9 @@
             </w:pPr>
             <w:r>
               <w:rPr>
-                <w:rStyle w:val="VerbatimChar"/>
-                <w:sz w:val="19"/>
-              </w:rPr>
-              <w:t xml:space="preserve">Ban da tu choi nhan tin QC tu [Brandname]. Cam on ban.</w:t>
-            </w:r>
-            <w:r>
-              <w:rPr>
-                <w:sz w:val="19"/>
-              </w:rPr>
-              <w:t xml:space="preserve"> </w:t>
-            </w:r>
-            <w:r>
-              <w:rPr>
-                <w:sz w:val="19"/>
-              </w:rPr>
-              <w:t xml:space="preserve">(và loại khỏi mọi tệp ngay)</w:t>
+                <w:sz w:val="19"/>
+              </w:rPr>
+              <w:t xml:space="preserve">Bạn đã từ chối nhận tin quảng cáo từ [Brandname]. Từ giờ bên mình sẽ không gửi nữa. (Đồng thời loại số này khỏi mọi tệp ngay.)</w:t>
             </w:r>
           </w:p>
         </w:tc>
@@ -9590,7 +9976,7 @@
         <w:pStyle w:val="Compact"/>
       </w:pPr>
       <w:r>
-        <w:t xml:space="preserve">☐ Đổi nhãn tin thành (QC), thêm cú pháp từ chối, viết không dấu ≤160 ký tự</w:t>
+        <w:t xml:space="preserve">☐ Đổi nhãn tin thành (QC), thêm cú pháp từ chối, viết giọng tự nhiên, kiểm số MT mỗi tin</w:t>
       </w:r>
     </w:p>
     <w:p>

</xml_diff>